<commit_message>
Skip hub welcome after returning from samples
</commit_message>
<xml_diff>
--- a/downloads/Personal_Website_Pricing_Guide.docx
+++ b/downloads/Personal_Website_Pricing_Guide.docx
@@ -2591,50 +2591,7 @@
         <w:spacing w:line="240" w:lineRule="auto"/>
       </w:pPr>
       <w:r>
-        <w:t>9. Message You Can Send To A Client</w:t>
-      </w:r>
-    </w:p>
-    <w:tbl>
-      <w:tblPr>
-        <w:tblStyle w:val="TableGrid"/>
-        <w:tblW w:type="auto" w:w="0"/>
-        <w:tblLook w:firstColumn="1" w:firstRow="1" w:lastColumn="0" w:lastRow="0" w:noHBand="0" w:noVBand="1" w:val="04A0"/>
-      </w:tblPr>
-      <w:tblGrid>
-        <w:gridCol w:w="10454"/>
-      </w:tblGrid>
-      <w:tr>
-        <w:tc>
-          <w:tcPr>
-            <w:tcW w:type="dxa" w:w="10454"/>
-            <w:shd w:fill="EEF2FF"/>
-            <w:tcBorders>
-              <w:top w:sz="8" w:val="single" w:color="B7C5FF" w:space="0"/>
-              <w:left w:sz="8" w:val="single" w:color="B7C5FF" w:space="0"/>
-              <w:bottom w:sz="8" w:val="single" w:color="B7C5FF" w:space="0"/>
-              <w:right w:sz="8" w:val="single" w:color="B7C5FF" w:space="0"/>
-            </w:tcBorders>
-          </w:tcPr>
-          <w:p>
-            <w:r>
-              <w:rPr>
-                <w:b/>
-                <w:color w:val="1F2937"/>
-                <w:sz w:val="18"/>
-              </w:rPr>
-              <w:t>I build simple personal and small business websites starting at $250. A regular one-page site starts at $250, and an animated one-page site starts at $350. A regular 3 to 5 page personal site starts at $500, and an animated 3 to 5 page site starts at $600. A small business site starts at $800. Domain and hosting are paid separately by the client. Extra features such as contact forms, project galleries, custom animations, or backend features can be added based on the scope.</w:t>
-            </w:r>
-          </w:p>
-        </w:tc>
-      </w:tr>
-    </w:tbl>
-    <w:p>
-      <w:pPr>
-        <w:pStyle w:val="Heading1"/>
-        <w:spacing w:line="240" w:lineRule="auto"/>
-      </w:pPr>
-      <w:r>
-        <w:t>10. Recommended Starting Prices</w:t>
+        <w:t>9. Recommended Starting Prices</w:t>
       </w:r>
     </w:p>
     <w:p>

</xml_diff>